<commit_message>
docs(thesis): align repo and Word draft with 2026-07-01 Physical AI narrative
Update README, reproducibility audit, replication package, and thesis outline
to center Phase A feature audit plus closed-loop approach and v9 ablation
results. Rebuild THESIS_DRAFT_FCU_v1.docx with new abstract, chapters 1-6,
fig3.1 architecture, and claim tables. Add closed-loop and Physical AI scripts
with unit tests for the canonical pipeline.
</commit_message>
<xml_diff>
--- a/thesis/THESIS_DRAFT_FCU_v1.docx
+++ b/thesis/THESIS_DRAFT_FCU_v1.docx
@@ -207,7 +207,7 @@
       </w:pPr>
       <w:bookmarkStart w:id="4" w:name="_Hlk57124045"/>
       <w:r>
-        <w:t>UR10 末端 RTX 聲學感測之可審計模擬管線研究：室內聲學特徵驗證與 Isaac Lab 延伸</w:t>
+        <w:t>基於 RTX Acoustic 超音波感測之機械手臂閉迴路接近控制與 Physical AI 狀態判斷</w:t>
       </w:r>
     </w:p>
     <w:p>
@@ -271,7 +271,7 @@
       <w:bookmarkStart w:id="5" w:name="_GoBack"/>
       <w:bookmarkEnd w:id="5"/>
       <w:r>
-        <w:t>中華民國 115 年 6 月</w:t>
+        <w:t>中華民國 115 年 7 月</w:t>
       </w:r>
     </w:p>
     <w:p>
@@ -619,7 +619,7 @@
         </w:rPr>
       </w:pPr>
       <w:r>
-        <w:t>中華民國 115 年 6 月</w:t>
+        <w:t>中華民國 115 年 7 月</w:t>
       </w:r>
     </w:p>
     <w:bookmarkEnd w:id="10"/>
@@ -633,7 +633,7 @@
         </w:rPr>
       </w:pPr>
       <w:r>
-        <w:t>本研究從應用電聲角度，探討室內主動聲學回波特徵能否在可控幾何下支撐趨勢級距離推理。研究平台為 NVIDIA Isaac Sim 6.0.0-rc.59 host standalone RTX Acoustic，感測器懸掛於 Universal Robots UR10 末端；實驗採固定 TCP、移動目標設計，於 0.5–3.0 m 範圍進行 6×5 次正式擷取，全部通過驗證（30/30 PASS）。結果顯示 primary_sgw_early_energy 優於飽和之振幅峰值作為距離代理（Spearman ρ≈−0.66, n=6），且與 PyRoomAcoustics early energy 呈中度正相關趨勢（ρ≈+0.66, p≈0.16, n=6），僅作 pilot cross-model characterization，非波形等價。延伸實驗將同一 Geometry Passport 與特徵工廠接入 Isaac Lab：動態場景 128 steps 觀測中，early_energy 與 GT 距離 ρ≈−0.48；Sim 靜態標定訓練之線性回歸於 Lab hold-out 達 MAE≈0.41 m、r≈0.47。in-sim RSL-RL PPO 閉環示範訓練迴路可行，但 hold-out 未優於監督基線（v5 det MAE≈0.44 m）。本研究貢獻為可審計模擬可行性管線與明確 claim boundary，非部署級測距或波形級數位雙生。</w:t>
+        <w:t>本研究從應用電聲角度，探討 RTX Acoustic 超音波特徵能否在 Isaac Sim 可控幾何下支撐趨勢級距離推理，並進一步驅動機械手臂閉迴路接近與離線 Physical AI 狀態估計。研究平台為 NVIDIA Isaac Sim 6.0.0-rc.59 host standalone，Phase A 採 UR10 固定 TCP、移動目標設計，於 0.5–3.0 m 進行 6×5 次正式擷取，全部通過驗證（30/30 PASS）；primary_sgw_early_energy 優於飽和振幅峰值作為距離代理（Spearman ρ≈−0.66, n=6）。Phase B/C 以 UR10e + Robotiq 2F-85 與腕部 RTX 感測器建構閉環接近管線，於隨機化目標位姿之 v9 資料集上，閉環組 approach ≤0.45 m 達 84.0%（25 trials），顯著優於 open-loop baseline 之 29.2%（24 trials）；離線 stop_region 分類中，acoustic_only 特徵 F1≈0.598，顯示聲學觀測含可測量狀態信號。最終夾取成功率約 20%（兩組相近），瓶頸在下游 PhysX 接觸／夾爪整合，非聲學接近本身。本研究貢獻為可審計模擬可行性管線與明確 claim boundary，非部署級測距或穩定端到端夾取系統。</w:t>
       </w:r>
     </w:p>
     <w:p>
@@ -757,7 +757,7 @@
         </w:rPr>
       </w:pPr>
       <w:r>
-        <w:t>關鍵詞：室內聲學；RTX Acoustic；signal-way 特徵；early energy；Isaac Sim；可重複性</w:t>
+        <w:t>關鍵詞：RTX Acoustic；閉迴路接近；Physical AI；early energy；Isaac Sim；可重複性</w:t>
       </w:r>
     </w:p>
     <w:p>
@@ -808,7 +808,7 @@
         </w:rPr>
       </w:pPr>
       <w:r>
-        <w:t>This thesis examines, from an applied electro-acoustics perspective, whether indoor active acoustic echo features support trend-level distance reasoning under controlled geometry. Using NVIDIA Isaac Sim 6.0.0-rc.59 host standalone RTX Acoustic on a UR10 end-effector with a fixed-TCP, moving-target protocol, all 30 formal captures (6 distances × 5 repeats) passed validation. primary_sgw_early_energy outperformed saturated amplitude peaks as a distance proxy (Spearman ρ≈−0.66, n=6) and showed a moderate positive trend with PyRoomAcoustics early energy (ρ≈+0.66, p≈0.16, n=6) as pilot cross-model characterization, without waveform equivalence. The same geometry passport and feature factory were extended in Isaac Lab: dynamic observations showed ρ≈−0.48 between early energy and ground-truth distance; Sim-trained linear regression achieved MAE≈0.41 m and r≈0.47 on Lab hold-out. In-simulation RSL-RL PPO demonstrated a feasible closed loop but did not beat the supervised baseline (v5 det MAE≈0.44 m). The contribution is an auditable feasibility pipeline with explicit claim boundaries, not deployment-grade ranging or waveform-faithful digital twins.</w:t>
+        <w:t>This thesis examines, from an applied electro-acoustics perspective, whether RTX Acoustic ultrasonic features support trend-level distance reasoning and closed-loop robotic approach in Isaac Sim. Phase A uses a fixed-TCP, moving-target protocol on a UR10 end-effector; all 30 formal captures (6 distances × 5 repeats) passed validation, with primary_sgw_early_energy outperforming saturated amplitude peaks (Spearman ρ≈−0.66, n=6). Phase B/C builds a UR10e + Robotiq closed-loop pipeline with wrist-mounted RTX sensing. On the randomized v9 dataset, closed-loop approach within 0.45 m reached 84.0% (25 trials) versus 29.2% for an open-loop baseline (24 trials). Offline stop-region classification with acoustic-only features achieved F1≈0.598. Final grasp success remained near 20% in both modes, indicating contact/gripper integration—not acoustic approach—as the limiting stage. The contribution is an auditable feasibility pipeline with explicit claim boundaries, not deployment-grade ranging or stable end-to-end grasping.</w:t>
       </w:r>
     </w:p>
     <w:p>
@@ -967,7 +967,7 @@
         </w:rPr>
       </w:pPr>
       <w:r>
-        <w:t>Keywords: indoor acoustics; RTX Acoustic; signal-way features; early energy; Isaac Sim; repeatability</w:t>
+        <w:t>Keywords: RTX Acoustic; closed-loop approach; Physical AI; early energy; Isaac Sim; repeatability</w:t>
       </w:r>
     </w:p>
     <w:p>
@@ -1340,7 +1340,7 @@
         <w:pStyle w:val="Content"/>
       </w:pPr>
       <w:r>
-        <w:t>室內主動聲學系統中，多徑傳播與殘響使接收信號同時承載幾何、材質與距離資訊，但各分量往往以弱耦合方式呈現於摘要特徵。在機器人末端非視覺測距應用中，如何從可控實驗條件下擷取可重現之聲學觀測，並據以判斷距離趨勢是否可被辨識，是應用電聲與機器人感知之交叉問題。NVIDIA Isaac Sim 6.0 提供 RTX Acoustic 實驗性模組，可輸出 Generic Model Output（GMO）signal-way 序列，為在模擬環境中系統化檢驗上述問題提供工具。</w:t>
+        <w:t>室內主動聲學系統中，多徑傳播與殘響使接收信號同時承載幾何、材質與距離資訊。在機器人末端非視覺 last-meter 接近中，如何從可控模擬條件擷取可重現聲學觀測，並據以驅動閉環運動與離線狀態判斷，是應用電聲與機器人感知之交叉問題。NVIDIA Isaac Sim 6.0 提供 RTX Acoustic 實驗性模組，可輸出 Generic Model Output（GMO）signal-way 序列，為系統化檢驗上述問題提供工具。</w:t>
       </w:r>
     </w:p>
     <w:p>
@@ -1348,7 +1348,7 @@
         <w:pStyle w:val="Content"/>
       </w:pPr>
       <w:r>
-        <w:t>本研究之核心問題為：在固定 TCP 與可審計幾何／材質條件下，RTX 聲學特徵（尤其 primary_sgw_early_energy）能否支撐趨勢級距離推理？此問題之答案應以可重複性與跨模型趨勢對照衡量，而非假設模擬波形等同實機超音波感測器或 CH201 硬體輸出。</w:t>
+        <w:t>與相機 + 視覺語言模型（VLM）端到端操作相比，本研究聚焦非視覺超聲閉環接近，定位為互補而非取代：VLM 擅長語義與粗定位，超聲擅長走廊內距離趨勢接近。</w:t>
       </w:r>
     </w:p>
     <w:p>
@@ -1364,7 +1364,7 @@
         <w:pStyle w:val="Content"/>
       </w:pPr>
       <w:r>
-        <w:t>主問題：Isaac Sim 可審計 RTX 聲學擷取管線是否可行且可重現？</w:t>
+        <w:t>RQ1（Phase A）：固定 TCP 下 RTX 特徵是否可重現且具距離趨勢？</w:t>
       </w:r>
     </w:p>
     <w:p>
@@ -1372,7 +1372,7 @@
         <w:pStyle w:val="Content"/>
       </w:pPr>
       <w:r>
-        <w:t>子問題一：early energy 等特徵對距離與材質條件之敏感度為何？</w:t>
+        <w:t>RQ2（Phase B）：閉環控制器能否改善目標區到達率（相對 open-loop）？</w:t>
       </w:r>
     </w:p>
     <w:p>
@@ -1380,7 +1380,15 @@
         <w:pStyle w:val="Content"/>
       </w:pPr>
       <w:r>
-        <w:t>子問題二：同一特徵定義能否遷移至 Isaac Lab 動態場景與學習迴路（監督／強化）？</w:t>
+        <w:t>RQ3（Phase B/C）：離線 Physical AI 是否含可測量聲學狀態信號？</w:t>
+      </w:r>
+    </w:p>
+    <w:p>
+      <w:pPr>
+        <w:pStyle w:val="Content"/>
+      </w:pPr>
+      <w:r>
+        <w:t>RQ4（Phase C，限制）：Tier B 接觸級夾取是否趨勢級可行？</w:t>
       </w:r>
     </w:p>
     <w:p>
@@ -1396,7 +1404,7 @@
         <w:pStyle w:val="Content"/>
       </w:pPr>
       <w:r>
-        <w:t>納入：Isaac Sim 6.0 host standalone、官方 UR10、六面牆房間、sensor→target 0.5–3.0 m（6 點）、材質 A/B/C、30 次正式實驗、Isaac Lab 動態 smoke 與 Sim→Lab 監督學習、in-sim RL 閉環示範。排除：CH201 實機量測、波形級 RTX–PRA 等價、移動手臂 IK 舊方案。</w:t>
+        <w:t>納入：Isaac Sim 6.0 host standalone、UR10/UR10e 官方資產、六面牆房間、Phase A 30/30 特徵實驗、Phase B/C 閉環接近與 v9 隨機化 Physical AI 資料集、Tier B contact-only（--skip-lift）夾取評估。排除：CH201 實機量測、波形級跨模擬器等價、穩定物理抬升、可部署學習控制器。</w:t>
       </w:r>
     </w:p>
     <w:p>
@@ -1404,7 +1412,7 @@
         <w:pStyle w:val="Content"/>
       </w:pPr>
       <w:r>
-        <w:t>限制：模擬 only；單一 TCP 姿態；early_energy 為啟發式（前 25% samples 能量和）；RTX Acoustic 為 experimental API；6 距離點旨在可行性而非回歸精度飽和。</w:t>
+        <w:t>限制：模擬 only；experimental API；控制器不讀目標世界座標作前進決策，但 supervisor 可用 oracle 距離作安全包絡；最終夾取成功率約 20%，應歸因 PhysX 接觸整合。</w:t>
       </w:r>
     </w:p>
     <w:p>
@@ -1420,7 +1428,7 @@
         <w:pStyle w:val="Content"/>
       </w:pPr>
       <w:r>
-        <w:t>GMO（Generic Model Output）：RTX 聲學感測輸出之結構化訊息，含 signal-way 振幅序列。Passport：可版本化之幾何／材質實驗護照。trend-level：趨勢級，允許單調相關但不宣稱絕對誤差達部署規格。claim boundary：可宣稱與不可宣稱之對照邊界（詳表6.1）。</w:t>
+        <w:t>Passport：可版本化之幾何／材質／任務實驗護照。trend-level：趨勢級，允許單調相關但不宣稱部署精度。claim boundary：可宣稱與不可宣稱之對照邊界（詳表6.1）。</w:t>
       </w:r>
     </w:p>
     <w:p>
@@ -1428,7 +1436,7 @@
         <w:pStyle w:val="Content"/>
       </w:pPr>
       <w:r>
-        <w:t>貢獻一（主）：建立 UR10 固定 TCP 下可審計 RTX 聲學管線，完成 30/30 可重複性與 RTX×PRA pilot 趨勢對照（n=6）。</w:t>
+        <w:t>貢獻一（主）：Geometry/Material Passport + 30/30 可審計 RTX 特徵管線（Phase A）。</w:t>
       </w:r>
     </w:p>
     <w:p>
@@ -1436,7 +1444,7 @@
         <w:pStyle w:val="Content"/>
       </w:pPr>
       <w:r>
-        <w:t>貢獻二（次）：延伸至 Isaac Lab 動態觀測與 Sim→Lab 監督遷移（r≈0.47，MAE≈0.41 m）。</w:t>
+        <w:t>貢獻二（次）：超聲閉環接近 + supervisor v1；v9 上 84% vs 29% 區域到達改善（Phase B）。</w:t>
       </w:r>
     </w:p>
     <w:p>
@@ -1444,7 +1452,15 @@
         <w:pStyle w:val="Content"/>
       </w:pPr>
       <w:r>
-        <w:t>貢獻三（附）：示範 in-sim RSL-RL 閉環可跑通；未優於監督基線，僅證訓練迴路可行性。</w:t>
+        <w:t>貢獻三（次）：隨機化 Sim 下 Physical AI 狀態估計基線（acoustic_only F1≈0.598）。</w:t>
+      </w:r>
+    </w:p>
+    <w:p>
+      <w:pPr>
+        <w:pStyle w:val="Content"/>
+      </w:pPr>
+      <w:r>
+        <w:t>貢獻四（附）：Tier B contact-only 示範與階段化評估框架；夾取瓶頸列為限制（Phase C）。</w:t>
       </w:r>
     </w:p>
     <w:p>
@@ -1545,10 +1561,34 @@
     </w:p>
     <w:p>
       <w:pPr>
+        <w:pStyle w:val="Header2"/>
+      </w:pPr>
+      <w:r>
+        <w:t>2.4 RTX Acoustic 與 GenericModelOutput</w:t>
+      </w:r>
+    </w:p>
+    <w:p>
+      <w:pPr>
         <w:pStyle w:val="Content"/>
       </w:pPr>
       <w:r>
-        <w:t>上述文獻為本研究選用 primary_sgw_early_energy 提供理論動機：在封閉工業房間中，早期信號能量隨距離呈趨勢性變化，但不宜將其直接等同物理 ToF 或宣稱厘米級精度。此設定與後文 PyRoomAcoustics 趨勢對照及 claim boundary 一致。</w:t>
+        <w:t>Isaac Sim 6.0 提供 RTX Acoustic 實驗性感測模組（NVIDIA, 2026a），以 GPU 路徑追蹤模擬聲波傳播，輸出 Generic Model Output（GMO）之 signal-way 張量。相較傳統幾何聲學套件（如 image-source 模型），RTX 路徑與材質互動方式不同，NVIDIA（2026c）亦將 RTX 感測與註解器（annotators）定位為可擴充之合成感測管線。</w:t>
+      </w:r>
+    </w:p>
+    <w:p>
+      <w:pPr>
+        <w:pStyle w:val="Content"/>
+      </w:pPr>
+      <w:r>
+        <w:t>GMO 欄位語義（NVIDIA, 2026b）定義 tx／rx／channel 維度與振幅取樣序列，為本研究 rtx_acoustic_factory 特徵萃取之依據。由於學術文獻中直接結合「RTX Acoustic + 工業手臂」之公開研究極少，平台鄰近工作如 Song 等（2025）之 OceanSim 示範：Isaac Sim 可擴充為專用 ray-traced 感測管線，支撐本研究以官方 API 建構可重現擷取流程之合理性。</w:t>
+      </w:r>
+    </w:p>
+    <w:p>
+      <w:pPr>
+        <w:pStyle w:val="Content"/>
+      </w:pPr>
+      <w:r>
+        <w:t>需再次強調：RTX Acoustic 目前標示為 experimental，文件亦未保證與實機 CH201 或 PRA 波形一致。本研究將其視為「可控幾何下之合成觀測來源」，而非物理 ground truth。</w:t>
       </w:r>
     </w:p>
     <w:p>
@@ -1556,7 +1596,7 @@
         <w:pStyle w:val="Header2"/>
       </w:pPr>
       <w:r>
-        <w:t>2.4 RTX Acoustic 與 GenericModelOutput</w:t>
+        <w:t>2.5 閉環感知、機器人接近與視覺語義操作對照</w:t>
       </w:r>
     </w:p>
     <w:p>
@@ -1564,7 +1604,7 @@
         <w:pStyle w:val="Content"/>
       </w:pPr>
       <w:r>
-        <w:t>Isaac Sim 6.0 提供 RTX Acoustic 實驗性感測模組（NVIDIA, 2026a），以 GPU 路徑追蹤模擬聲波傳播，輸出 Generic Model Output（GMO）之 signal-way 張量。相較傳統幾何聲學套件（如 image-source 模型），RTX 路徑與材質互動方式不同，NVIDIA（2026c）亦將 RTX 感測與註解器（annotators）定位為可擴充之合成感測管線。</w:t>
+        <w:t>非視覺機器人接近控制文獻多結合主動聲學、ToF 或觸覺作 last-meter 感知。與端到端視覺—語言—動作（VLM）管線相比，本研究不宣稱全任務語義操作，而聚焦於「已知搜尋走廊內、以超聲特徵驅動之距離趨勢接近」。此定位與 VLM 粗定位 + 非視覺精接近之 hybrid 架構互補，而非直接取代。</w:t>
       </w:r>
     </w:p>
     <w:p>
@@ -1572,7 +1612,15 @@
         <w:pStyle w:val="Content"/>
       </w:pPr>
       <w:r>
-        <w:t>GMO 欄位語義（NVIDIA, 2026b）定義 tx／rx／channel 維度與振幅取樣序列，為本研究 rtx_acoustic_factory 特徵萃取之依據。由於學術文獻中直接結合「RTX Acoustic + 工業手臂」之公開研究極少，平台鄰近工作如 Song 等（2025）之 OceanSim 示範：Isaac Sim 可擴充為專用 ray-traced 感測管線，支撐本研究以官方 API 建構可重現擷取流程之合理性。</w:t>
+        <w:t>在狀態估計與 Physical AI 脈絡下，機器人操作常需將感測觀測映射為離散階段標籤（如 near、stop region）。本研究以隨機化 Sim 協定檢驗：當幾何起點與目標橫向位置變化時，聲學特徵是否仍含可測量信號，並以 open-loop baseline 對照閉環控制器之區域到達率改善。</w:t>
+      </w:r>
+    </w:p>
+    <w:p>
+      <w:pPr>
+        <w:pStyle w:val="Header2"/>
+      </w:pPr>
+      <w:r>
+        <w:t>2.6 Physical AI 狀態估計與模擬可審計性</w:t>
       </w:r>
     </w:p>
     <w:p>
@@ -1580,7 +1628,7 @@
         <w:pStyle w:val="Content"/>
       </w:pPr>
       <w:r>
-        <w:t>需再次強調：RTX Acoustic 目前標示為 experimental，文件亦未保證與實機 CH201 或 PRA 波形一致。本研究將其視為「可控幾何下之合成觀測來源」，而非物理 ground truth。</w:t>
+        <w:t>Physical AI 強調從物理世界觀測學習可解釋狀態表示。本研究之離線 ablation（acoustic_only vs pose_only vs all_features）屬趨勢級 feasibility，目的在證明 RTX GMO 特徵含狀態資訊，而非宣稱已得可部署之端到端策略。</w:t>
       </w:r>
     </w:p>
     <w:p>
@@ -1588,7 +1636,7 @@
         <w:pStyle w:val="Header2"/>
       </w:pPr>
       <w:r>
-        <w:t>2.5 PyRoomAcoustics 房間聲學基線</w:t>
+        <w:t>2.7 文獻缺口與本研究定位</w:t>
       </w:r>
     </w:p>
     <w:p>
@@ -1596,7 +1644,7 @@
         <w:pStyle w:val="Content"/>
       </w:pPr>
       <w:r>
-        <w:t>為避免單一模擬器之模型偏差，本研究引入 PyRoomAcoustics（Scheibler 等, 2018）作為幾何聲學基線。Brinkmann 等（2019）之 round-robin 研究顯示，不同房間聲學模擬器對 RIR 之預測存在系統性差異，故跨模擬器比較應限於趨勢級（trend-level）對照，而非波形級等價檢定。</w:t>
+        <w:t>綜合前述各面向，現有文獻多覆蓋子集而非完整交集：Isaac Sim 平台研究鮮少同時處理 RTX Acoustic 可重複性與閉環接近；聲學機器人研究多未提供可審計 Passport 管線；VLM 操作研究則少見以 RTX 超聲作 last-meter 非視覺閉環。在 UR10e 工業手臂 + 腕部超聲場景下，同時整合上述要素之公開工作仍屬稀疏。</w:t>
       </w:r>
     </w:p>
     <w:p>
@@ -1604,7 +1652,23 @@
         <w:pStyle w:val="Content"/>
       </w:pPr>
       <w:r>
-        <w:t>在特徵—距離推理文獻方面，dEchorate 資料集（2021）提供標定 RIR 與回波特徵，支撐以聲學摘要特徵進行距離相關學習之可行性。本研究 Phase 3 以 PRA 萃取 early energy、RT60 等與 RTX 同幾何對齊，於 n=6 距離點觀察到 early energy 中度正相關趨勢（Spearman ρ≈+0.66, p≈0.16），惟樣本數有限且未達顯著，僅作 pilot cross-model characterization；振幅尺度與飽和行為亦不同，再次印證「趨勢可對、波形不等」之 claim boundary。</w:t>
+        <w:t>本研究定位為 simulation-based feasibility pipeline（模擬可行性管線）：Phase A 以 Geometry／Material Passport 與 30/30 協定建立特徵可審計性；Phase B/C 以閉環接近與隨機化 Physical AI 資料集驗證狀態信號與區域到達改善；Tier B contact-only 夾取僅作下游評估與限制說明，而非主貢獻。</w:t>
+      </w:r>
+    </w:p>
+    <w:p>
+      <w:pPr>
+        <w:pStyle w:val="Content"/>
+      </w:pPr>
+      <w:r>
+        <w:t>因此，本論文貢獻不在提出新聲學物理模型，而在填補 G0 缺口：建立 UR10 系列 + RTX Acoustic + 閉環接近 + 離線狀態估計之可重現 Sim 工作流程，為後續 CH201 實機 task-level 驗證預留協定與評估邊界。</w:t>
+      </w:r>
+    </w:p>
+    <w:p>
+      <w:pPr>
+        <w:pStyle w:val="Header1"/>
+      </w:pPr>
+      <w:r>
+        <w:t>第三章、研究方法</w:t>
       </w:r>
     </w:p>
     <w:p>
@@ -1612,7 +1676,7 @@
         <w:pStyle w:val="Header2"/>
       </w:pPr>
       <w:r>
-        <w:t>2.6 文獻缺口與本研究定位</w:t>
+        <w:t>3.1 研究架構</w:t>
       </w:r>
     </w:p>
     <w:p>
@@ -1620,47 +1684,7 @@
         <w:pStyle w:val="Content"/>
       </w:pPr>
       <w:r>
-        <w:t>綜合前述各面向，現有文獻多覆蓋子集而非完整交集：Isaac Sim 平台研究（F2）鮮少同時處理 RTX Acoustic 距離可重複性；聲學機器人研究（F4/F6）多未提供 Isaac／Omniverse 可審計管線；Isaac Lab 閉環 RL（F7）亦少見以 RTX GMO 為觀測源之距離估計實驗。在工業固定 TCP 手臂場景下，同時整合上述要素之公開工作仍屬稀疏。</w:t>
-      </w:r>
-    </w:p>
-    <w:p>
-      <w:pPr>
-        <w:pStyle w:val="Content"/>
-      </w:pPr>
-      <w:r>
-        <w:t>Xu 等（2024）論述製造數位雙生需可重現模擬管線，呼應電聲與機器人應用交叉之模擬驗證需求。本研究定位為 simulation-based feasibility pipeline（模擬可行性管線）與 methodological bridge（Sim 靜態校準 → Lab 動態觀測 → 可選 in-sim RL）：以 Geometry／Material Passport、30/30 可重複性協定與 replication package 提供可審計證據，並以監督學習（§5.3, r≈0.47）示範趨勢級距離推理，而非宣稱部署級測距或波形等價。</w:t>
-      </w:r>
-    </w:p>
-    <w:p>
-      <w:pPr>
-        <w:pStyle w:val="Content"/>
-      </w:pPr>
-      <w:r>
-        <w:t>因此，本論文貢獻不在提出新聲學物理模型，而在填補 G0 缺口：建立 UR10 固定 TCP + RTX Acoustic + Isaac Lab 延伸之端到端可重現工作流程，為後續 CH201 實機 task-level 驗證預留協定與評估邊界。</w:t>
-      </w:r>
-    </w:p>
-    <w:p>
-      <w:pPr>
-        <w:pStyle w:val="Header1"/>
-      </w:pPr>
-      <w:r>
-        <w:t>第三章、研究方法</w:t>
-      </w:r>
-    </w:p>
-    <w:p>
-      <w:pPr>
-        <w:pStyle w:val="Header2"/>
-      </w:pPr>
-      <w:r>
-        <w:t>3.1 研究架構</w:t>
-      </w:r>
-    </w:p>
-    <w:p>
-      <w:pPr>
-        <w:pStyle w:val="Content"/>
-      </w:pPr>
-      <w:r>
-        <w:t>本研究主線為 Isaac Sim 可審計管線（第三、四章）；Isaac Lab 動態觀測與學習示範為延伸（第五章）。圖3.1 示固態流程：Passport 定義變量 → RTX 擷取 → 特徵工廠 → PRA 趨勢對照 → Sim 主實驗評估；虛線為同一 Passport／Factory 接入 Lab 之延伸路徑。</w:t>
+        <w:t>本研究採 Phase A→B→C 三階架構（圖3.1）：Phase A 驗證特徵可審計性；Phase B 驗證閉環接近；Phase C 評估 Tier B 接觸與離線 Physical AI 狀態估計。Isaac Lab 動態觀測與 SL/RL 示範保留為附錄延伸，非主貢獻。</w:t>
       </w:r>
     </w:p>
     <w:p>
@@ -1671,7 +1695,7 @@
       <w:r>
         <w:drawing>
           <wp:inline xmlns:a="http://schemas.openxmlformats.org/drawingml/2006/main" xmlns:pic="http://schemas.openxmlformats.org/drawingml/2006/picture">
-            <wp:extent cx="4754880" cy="2593571"/>
+            <wp:extent cx="4754880" cy="2833716"/>
             <wp:docPr id="1" name="Picture 1"/>
             <wp:cNvGraphicFramePr>
               <a:graphicFrameLocks noChangeAspect="1"/>
@@ -1680,11 +1704,11 @@
               <a:graphicData uri="http://schemas.openxmlformats.org/drawingml/2006/picture">
                 <pic:pic>
                   <pic:nvPicPr>
-                    <pic:cNvPr id="0" name="image.png"/>
+                    <pic:cNvPr id="0" name="fig3_1_research_architecture.png"/>
                     <pic:cNvPicPr/>
                   </pic:nvPicPr>
                   <pic:blipFill>
-                    <a:blip r:embed="rId30"/>
+                    <a:blip r:embed="rId31"/>
                     <a:stretch>
                       <a:fillRect/>
                     </a:stretch>
@@ -1692,7 +1716,7 @@
                   <pic:spPr>
                     <a:xfrm>
                       <a:off x="0" y="0"/>
-                      <a:ext cx="4754880" cy="2593571"/>
+                      <a:ext cx="4754880" cy="2833716"/>
                     </a:xfrm>
                     <a:prstGeom prst="rect"/>
                   </pic:spPr>
@@ -1709,7 +1733,7 @@
         <w:jc w:val="center"/>
       </w:pPr>
       <w:r>
-        <w:t>圖3.1  研究架構（實線：Sim 主線；虛線：Lab 延伸）</w:t>
+        <w:t>圖3.1  研究架構（Phase A→B→C + Physical AI）</w:t>
       </w:r>
     </w:p>
     <w:p>
@@ -1725,7 +1749,7 @@
         <w:pStyle w:val="Content"/>
       </w:pPr>
       <w:r>
-        <w:t>Isaac Sim 6.0 host standalone（6.0.0-rc.59），以 scripts/run_host_python.sh 與 env_host_isolated.sh 隔離執行。機器人為官方 UR10 USD；RTX Acoustic 掛載於 ee_link/official_rtx_acoustic。</w:t>
+        <w:t>Isaac Sim 6.0 host standalone（6.0.0-rc.59），以 scripts/env_host_isolated.sh 隔離執行。Phase A 使用官方 UR10；Phase B/C 使用 UR10e + Robotiq 2F-85，RTX 感測器掛載於腕部連桿。</w:t>
       </w:r>
     </w:p>
     <w:p>
@@ -1733,7 +1757,7 @@
         <w:pStyle w:val="Header2"/>
       </w:pPr>
       <w:r>
-        <w:t>3.3 實驗設計：fixed_tcp_moving_target</w:t>
+        <w:t>3.3 Phase A：fixed_tcp_moving_target</w:t>
       </w:r>
     </w:p>
     <w:p>
@@ -1749,7 +1773,7 @@
         <w:pStyle w:val="Header2"/>
       </w:pPr>
       <w:r>
-        <w:t>3.4 Geometry Passport 與 Material Passport</w:t>
+        <w:t>3.4 Passport 體系</w:t>
       </w:r>
     </w:p>
     <w:p>
@@ -1757,7 +1781,7 @@
         <w:pStyle w:val="Content"/>
       </w:pPr>
       <w:r>
-        <w:t>Geometry Passport v1.0：房間 4.5 m×3.0 m×2.8 m、感測器掛載、目標軌跡。Material Passport v1.0：NonVisualMaterial 條件 A（低吸收）、B（中吸收，主實驗）、C（高吸收）。</w:t>
+        <w:t>Geometry Passport v1.0：房間、感測器掛載、目標軌跡。Material Passport v1.0：NonVisualMaterial 條件 A/B/C。Grasp Passport v1.0：搜尋走廊、standoff、UR10e/Robotiq 任務幾何。</w:t>
       </w:r>
     </w:p>
     <w:p>
@@ -1773,7 +1797,7 @@
         <w:pStyle w:val="Content"/>
       </w:pPr>
       <w:r>
-        <w:t>以 Replicator Writer 擷取 GMO；timeline.play() 驅動步進。rtx_acoustic_factory.py 驗證結構並解析 signal-way，萃取 primary_sgw_early_energy（前 25% samples 能量和）、primary_sgw_peak 等。</w:t>
+        <w:t>以 Replicator Writer 擷取 GMO；rtx_acoustic_factory.py 解析 signal-way，萃取 primary_sgw_early_energy、TOF、雙 RX 平衡等特徵。</w:t>
       </w:r>
     </w:p>
     <w:p>
@@ -1781,7 +1805,7 @@
         <w:pStyle w:val="Header2"/>
       </w:pPr>
       <w:r>
-        <w:t>3.6 PyRoomAcoustics 趨勢參考協定</w:t>
+        <w:t>3.6 Phase B：UltrasonicClosedLoopController</w:t>
       </w:r>
     </w:p>
     <w:p>
@@ -1789,7 +1813,7 @@
         <w:pStyle w:val="Content"/>
       </w:pPr>
       <w:r>
-        <w:t>PyRoomAcoustics v0.10.1 批次產生與 Geometry Passport 對齊之 RIR；萃取 RT60、early energy 等。PRA 僅作趨勢參考，非 RTX 波形 ground truth。</w:t>
+        <w:t>純 Python 狀態機（ultrasonic_closed_loop_controller.py），融合 early_energy、TOF 與對齊分數估計距離趨勢並驅動逐步接近。控制器不消費目標世界座標作前進決策；oracle 距離僅供評估記錄。</w:t>
       </w:r>
     </w:p>
     <w:p>
@@ -1797,7 +1821,7 @@
         <w:pStyle w:val="Header2"/>
       </w:pPr>
       <w:r>
-        <w:t>3.7 評估指標與 claim boundary</w:t>
+        <w:t>3.7 Phase C：supervisor、contact-only 與隨機化協定</w:t>
       </w:r>
     </w:p>
     <w:p>
@@ -1805,7 +1829,23 @@
         <w:pStyle w:val="Content"/>
       </w:pPr>
       <w:r>
-        <w:t>可重複性：30/30 PASS、gmo_valid_rate、跨 repeat CV。趨勢：Spearman ρ（距離／材質）。延伸：Lab 動態 ρ、Sim→Lab SL 之 MAE／Pearson r、RL hold-out 對照。全書以表6.1 集中界定可宣稱與不可宣稱項目。</w:t>
+        <w:t>approach_supervisor_v1.py 於 fusion 飽和或前進上限時以 oracle 距離作安全仲裁，建議進入 standoff／夾取階段。預設 --skip-lift（FixedCuboid）以隔離 PhysX lift 不穩定。v8/v9 管線隨機化 search start 與 wrench 橫向位置，打破 sensor_x/y 捷徑。</w:t>
+      </w:r>
+    </w:p>
+    <w:p>
+      <w:pPr>
+        <w:pStyle w:val="Header2"/>
+      </w:pPr>
+      <w:r>
+        <w:t>3.8 評估指標與 claim boundary</w:t>
+      </w:r>
+    </w:p>
+    <w:p>
+      <w:pPr>
+        <w:pStyle w:val="Content"/>
+      </w:pPr>
+      <w:r>
+        <w:t>Phase A：30/30 PASS、Spearman ρ、跨 repeat CV。Phase B/C：approach/near/final 階段成功率、closed-loop vs open-loop 對照、Physical AI ablation（F1、balanced accuracy）。全書以表6.1 集中界定可宣稱與不可宣稱項目。</w:t>
       </w:r>
     </w:p>
     <w:p>
@@ -1813,7 +1853,7 @@
         <w:pStyle w:val="Header1"/>
       </w:pPr>
       <w:r>
-        <w:t>第四章、Isaac Sim 實證結果與分析</w:t>
+        <w:t>第四章、特徵驗證結果（Phase A）</w:t>
       </w:r>
     </w:p>
     <w:p>
@@ -1837,7 +1877,7 @@
         <w:pStyle w:val="Header2"/>
       </w:pPr>
       <w:r>
-        <w:t>4.2 距離趨勢與 RTX×PRA 對照</w:t>
+        <w:t>4.2 距離趨勢</w:t>
       </w:r>
     </w:p>
     <w:p>
@@ -1845,7 +1885,7 @@
         <w:pStyle w:val="Content"/>
       </w:pPr>
       <w:r>
-        <w:t>材質 B、5 repeats 平均：amplitude_max 於 1.0 m 後飽和；primary_sgw_early_energy 與距離 ρ≈−0.66（n=6）。RTX 與 PRA early energy 呈中度正相關趨勢（ρ≈+0.66, p≈0.16, n=6），振幅尺度不同；未達統計顯著，僅作 pilot cross-model characterization，非波形等價。</w:t>
+        <w:t>材質 B、5 repeats 平均：amplitude_max 於 1.0 m 後飽和；primary_sgw_early_energy 與距離 Spearman ρ≈−0.66（n=6），優於 peak 作為距離 proxy。</w:t>
       </w:r>
     </w:p>
     <w:p>
@@ -1914,11 +1954,11 @@
               <a:graphicData uri="http://schemas.openxmlformats.org/drawingml/2006/picture">
                 <pic:pic>
                   <pic:nvPicPr>
-                    <pic:cNvPr id="0" name="image.png"/>
+                    <pic:cNvPr id="0" name="fig4_2_rtx_early_energy_vs_distance.png"/>
                     <pic:cNvPicPr/>
                   </pic:nvPicPr>
                   <pic:blipFill>
-                    <a:blip r:embed="rId23"/>
+                    <a:blip r:embed="rId32"/>
                     <a:stretch>
                       <a:fillRect/>
                     </a:stretch>
@@ -1948,13 +1988,29 @@
     </w:p>
     <w:p>
       <w:pPr>
+        <w:pStyle w:val="Header2"/>
+      </w:pPr>
+      <w:r>
+        <w:t>4.3 材質敏感度（A/B/C）</w:t>
+      </w:r>
+    </w:p>
+    <w:p>
+      <w:pPr>
+        <w:pStyle w:val="Content"/>
+      </w:pPr>
+      <w:r>
+        <w:t>primary_sgw_peak 於 0.5 m 與 3.0 m 幾乎無差；early_energy @0.5 m 可區分 C（≈190.6）與 A/B（≈165.4），顯示材質吸收對早期能量之影響。</w:t>
+      </w:r>
+    </w:p>
+    <w:p>
+      <w:pPr>
         <w:pStyle w:val="Content"/>
         <w:jc w:val="center"/>
       </w:pPr>
       <w:r>
         <w:drawing>
           <wp:inline xmlns:a="http://schemas.openxmlformats.org/drawingml/2006/main" xmlns:pic="http://schemas.openxmlformats.org/drawingml/2006/picture">
-            <wp:extent cx="4754880" cy="3896210"/>
+            <wp:extent cx="4754880" cy="3169920"/>
             <wp:docPr id="4" name="Picture 4"/>
             <wp:cNvGraphicFramePr>
               <a:graphicFrameLocks noChangeAspect="1"/>
@@ -1963,76 +2019,11 @@
               <a:graphicData uri="http://schemas.openxmlformats.org/drawingml/2006/picture">
                 <pic:pic>
                   <pic:nvPicPr>
-                    <pic:cNvPr id="0" name="image.png"/>
+                    <pic:cNvPr id="0" name="fig4_4_material_early_energy_0p5m.png"/>
                     <pic:cNvPicPr/>
                   </pic:nvPicPr>
                   <pic:blipFill>
-                    <a:blip r:embed="rId24"/>
-                    <a:stretch>
-                      <a:fillRect/>
-                    </a:stretch>
-                  </pic:blipFill>
-                  <pic:spPr>
-                    <a:xfrm>
-                      <a:off x="0" y="0"/>
-                      <a:ext cx="4754880" cy="3896210"/>
-                    </a:xfrm>
-                    <a:prstGeom prst="rect"/>
-                  </pic:spPr>
-                </pic:pic>
-              </a:graphicData>
-            </a:graphic>
-          </wp:inline>
-        </w:drawing>
-      </w:r>
-    </w:p>
-    <w:p>
-      <w:pPr>
-        <w:pStyle w:val="Content"/>
-        <w:jc w:val="center"/>
-      </w:pPr>
-      <w:r>
-        <w:t>圖4.3  PyRoomAcoustics 特徵與目標距離趨勢對照</w:t>
-      </w:r>
-    </w:p>
-    <w:p>
-      <w:pPr>
-        <w:pStyle w:val="Header2"/>
-      </w:pPr>
-      <w:r>
-        <w:t>4.3 材質敏感度（A/B/C）</w:t>
-      </w:r>
-    </w:p>
-    <w:p>
-      <w:pPr>
-        <w:pStyle w:val="Content"/>
-      </w:pPr>
-      <w:r>
-        <w:t>primary_sgw_peak 於 0.5 m 與 3.0 m 幾乎無差；early_energy @0.5 m 可區分 C（≈190.6）與 A/B（≈165.4）。PRA RT60 對材質吸收更敏感。</w:t>
-      </w:r>
-    </w:p>
-    <w:p>
-      <w:pPr>
-        <w:pStyle w:val="Content"/>
-        <w:jc w:val="center"/>
-      </w:pPr>
-      <w:r>
-        <w:drawing>
-          <wp:inline xmlns:a="http://schemas.openxmlformats.org/drawingml/2006/main" xmlns:pic="http://schemas.openxmlformats.org/drawingml/2006/picture">
-            <wp:extent cx="4754880" cy="3169920"/>
-            <wp:docPr id="5" name="Picture 5"/>
-            <wp:cNvGraphicFramePr>
-              <a:graphicFrameLocks noChangeAspect="1"/>
-            </wp:cNvGraphicFramePr>
-            <a:graphic>
-              <a:graphicData uri="http://schemas.openxmlformats.org/drawingml/2006/picture">
-                <pic:pic>
-                  <pic:nvPicPr>
-                    <pic:cNvPr id="0" name="image.png"/>
-                    <pic:cNvPicPr/>
-                  </pic:nvPicPr>
-                  <pic:blipFill>
-                    <a:blip r:embed="rId25"/>
+                    <a:blip r:embed="rId33"/>
                     <a:stretch>
                       <a:fillRect/>
                     </a:stretch>
@@ -2057,7 +2048,7 @@
         <w:jc w:val="center"/>
       </w:pPr>
       <w:r>
-        <w:t>圖4.4  材質 A/B/C 於 0.5 m 之 early_energy 比較</w:t>
+        <w:t>圖4.3  材質 A/B/C 於 0.5 m 之 early_energy 比較</w:t>
       </w:r>
     </w:p>
     <w:p>
@@ -2073,7 +2064,7 @@
         <w:pStyle w:val="Content"/>
       </w:pPr>
       <w:r>
-        <w:t>P1 smoke 驗證 rtx_acoustic_factory 對 GMO 之結構檢查：signal-way 維度、ACOUSTIC 模態、primary/ref/all peak 一致性與非平坦波形條件。NonVisualMaterial 條件之 NV ID 解碼與 Passport 登錄一致。P1 確保特徵萃取前資料有效，屬管線穩健性而非獨立物理假設檢驗。</w:t>
+        <w:t>P1 smoke 驗證 rtx_acoustic_factory 對 GMO 之結構檢查：signal-way 維度、ACOUSTIC 模態、primary/ref/all peak 一致性與非平坦波形條件。P1 確保特徵萃取前資料有效。</w:t>
       </w:r>
     </w:p>
     <w:p>
@@ -2081,7 +2072,7 @@
         <w:pStyle w:val="Header1"/>
       </w:pPr>
       <w:r>
-        <w:t>第五章、Isaac Lab 延伸與學習示範</w:t>
+        <w:t>第五章、閉環接近、Physical AI 與夾取評估（Phase B/C）</w:t>
       </w:r>
     </w:p>
     <w:p>
@@ -2089,7 +2080,7 @@
         <w:pStyle w:val="Header2"/>
       </w:pPr>
       <w:r>
-        <w:t>5.1 動態環境與觀測協定</w:t>
+        <w:t>5.1 實驗協定與資料集</w:t>
       </w:r>
     </w:p>
     <w:p>
@@ -2097,7 +2088,7 @@
         <w:pStyle w:val="Content"/>
       </w:pPr>
       <w:r>
-        <w:t>Ur10RtxAcousticDynamicEnv 重用 Sim 之 Passport 與 Factory；目標正弦運動 d(t)=1.5+0.5·sin(2π·step/64) m，128 steps，GMO decimation=4。觀測含 early_energy、peak、gmo_valid 與 GT 距離。</w:t>
+        <w:t>Canonical 資料集：physical_ai_v9_skip_lift_clean（49 trial 目錄、284 step rows；closed_loop 25 trials、open_loop_baseline 24 trials）。接觸模式：--skip-lift / FixedCuboid，避免 PhysX lift 污染。控制器：closed_loop 使用超聲融合距離估計；open_loop_baseline 作對照。</w:t>
       </w:r>
     </w:p>
     <w:p>
@@ -2105,7 +2096,7 @@
         <w:pStyle w:val="Header2"/>
       </w:pPr>
       <w:r>
-        <w:t>5.2 動態觀測結果</w:t>
+        <w:t>5.2 閉環 vs open-loop 接近成功率</w:t>
       </w:r>
     </w:p>
     <w:p>
@@ -2113,7 +2104,7 @@
         <w:pStyle w:val="Content"/>
       </w:pPr>
       <w:r>
-        <w:t>27 步有效 GMO（gmo_valid_rate=1.0）；max_sensor_position_motion_m=0。primary_sgw_early_energy 與 GT 距離 Pearson ρ=−0.475（n=27），方向與 Sim 一致。</w:t>
+        <w:t>階段化審計顯示：閉環組在 approach ≤0.45 m 與 near ≤0.35 m 均達 84.0%，open-loop 分別僅 29.2% 與 4.2%。最終 success 兩組皆約 20%，表明聲學閉環主要改善區域到達，而非下游夾取執行。</w:t>
       </w:r>
     </w:p>
     <w:p>
@@ -2122,235 +2113,7 @@
         <w:jc w:val="center"/>
       </w:pPr>
       <w:r>
-        <w:drawing>
-          <wp:inline xmlns:a="http://schemas.openxmlformats.org/drawingml/2006/main" xmlns:pic="http://schemas.openxmlformats.org/drawingml/2006/picture">
-            <wp:extent cx="4754880" cy="2717074"/>
-            <wp:docPr id="6" name="Picture 6"/>
-            <wp:cNvGraphicFramePr>
-              <a:graphicFrameLocks noChangeAspect="1"/>
-            </wp:cNvGraphicFramePr>
-            <a:graphic>
-              <a:graphicData uri="http://schemas.openxmlformats.org/drawingml/2006/picture">
-                <pic:pic>
-                  <pic:nvPicPr>
-                    <pic:cNvPr id="0" name="image.png"/>
-                    <pic:cNvPicPr/>
-                  </pic:nvPicPr>
-                  <pic:blipFill>
-                    <a:blip r:embed="rId26"/>
-                    <a:stretch>
-                      <a:fillRect/>
-                    </a:stretch>
-                  </pic:blipFill>
-                  <pic:spPr>
-                    <a:xfrm>
-                      <a:off x="0" y="0"/>
-                      <a:ext cx="4754880" cy="2717074"/>
-                    </a:xfrm>
-                    <a:prstGeom prst="rect"/>
-                  </pic:spPr>
-                </pic:pic>
-              </a:graphicData>
-            </a:graphic>
-          </wp:inline>
-        </w:drawing>
-      </w:r>
-    </w:p>
-    <w:p>
-      <w:pPr>
-        <w:pStyle w:val="Content"/>
-        <w:jc w:val="center"/>
-      </w:pPr>
-      <w:r>
-        <w:t>圖5.1  動態場景 GT 距離軌跡（1.0–2.0 m）</w:t>
-      </w:r>
-    </w:p>
-    <w:p>
-      <w:pPr>
-        <w:pStyle w:val="Content"/>
-        <w:jc w:val="center"/>
-      </w:pPr>
-      <w:r>
-        <w:drawing>
-          <wp:inline xmlns:a="http://schemas.openxmlformats.org/drawingml/2006/main" xmlns:pic="http://schemas.openxmlformats.org/drawingml/2006/picture">
-            <wp:extent cx="4754880" cy="2717074"/>
-            <wp:docPr id="7" name="Picture 7"/>
-            <wp:cNvGraphicFramePr>
-              <a:graphicFrameLocks noChangeAspect="1"/>
-            </wp:cNvGraphicFramePr>
-            <a:graphic>
-              <a:graphicData uri="http://schemas.openxmlformats.org/drawingml/2006/picture">
-                <pic:pic>
-                  <pic:nvPicPr>
-                    <pic:cNvPr id="0" name="image.png"/>
-                    <pic:cNvPicPr/>
-                  </pic:nvPicPr>
-                  <pic:blipFill>
-                    <a:blip r:embed="rId27"/>
-                    <a:stretch>
-                      <a:fillRect/>
-                    </a:stretch>
-                  </pic:blipFill>
-                  <pic:spPr>
-                    <a:xfrm>
-                      <a:off x="0" y="0"/>
-                      <a:ext cx="4754880" cy="2717074"/>
-                    </a:xfrm>
-                    <a:prstGeom prst="rect"/>
-                  </pic:spPr>
-                </pic:pic>
-              </a:graphicData>
-            </a:graphic>
-          </wp:inline>
-        </w:drawing>
-      </w:r>
-    </w:p>
-    <w:p>
-      <w:pPr>
-        <w:pStyle w:val="Content"/>
-        <w:jc w:val="center"/>
-      </w:pPr>
-      <w:r>
-        <w:t>圖5.2  Lab early_energy 與 GT 距離（ρ≈−0.48）</w:t>
-      </w:r>
-    </w:p>
-    <w:p>
-      <w:pPr>
-        <w:pStyle w:val="Header2"/>
-      </w:pPr>
-      <w:r>
-        <w:t>5.3 Sim→Lab 監督學習</w:t>
-      </w:r>
-    </w:p>
-    <w:p>
-      <w:pPr>
-        <w:pStyle w:val="Content"/>
-      </w:pPr>
-      <w:r>
-        <w:t>Sim n=125 訓練單變量線性回歸（early_energy）；Lab n=27 測試：MAE=0.41 m、RMSE=0.52 m、r=0.47。加入 peak 之雙特徵模型 MAE 升至 0.44 m（peak 飽和）。此為趨勢級示範，非部署精度。</w:t>
-      </w:r>
-    </w:p>
-    <w:p>
-      <w:pPr>
-        <w:pStyle w:val="Content"/>
-        <w:jc w:val="center"/>
-      </w:pPr>
-      <w:r>
-        <w:drawing>
-          <wp:inline xmlns:a="http://schemas.openxmlformats.org/drawingml/2006/main" xmlns:pic="http://schemas.openxmlformats.org/drawingml/2006/picture">
-            <wp:extent cx="4754880" cy="3962400"/>
-            <wp:docPr id="8" name="Picture 8"/>
-            <wp:cNvGraphicFramePr>
-              <a:graphicFrameLocks noChangeAspect="1"/>
-            </wp:cNvGraphicFramePr>
-            <a:graphic>
-              <a:graphicData uri="http://schemas.openxmlformats.org/drawingml/2006/picture">
-                <pic:pic>
-                  <pic:nvPicPr>
-                    <pic:cNvPr id="0" name="image.png"/>
-                    <pic:cNvPicPr/>
-                  </pic:nvPicPr>
-                  <pic:blipFill>
-                    <a:blip r:embed="rId28"/>
-                    <a:stretch>
-                      <a:fillRect/>
-                    </a:stretch>
-                  </pic:blipFill>
-                  <pic:spPr>
-                    <a:xfrm>
-                      <a:off x="0" y="0"/>
-                      <a:ext cx="4754880" cy="3962400"/>
-                    </a:xfrm>
-                    <a:prstGeom prst="rect"/>
-                  </pic:spPr>
-                </pic:pic>
-              </a:graphicData>
-            </a:graphic>
-          </wp:inline>
-        </w:drawing>
-      </w:r>
-    </w:p>
-    <w:p>
-      <w:pPr>
-        <w:pStyle w:val="Content"/>
-        <w:jc w:val="center"/>
-      </w:pPr>
-      <w:r>
-        <w:t>圖5.3  Sim 訓練→Lab 測試：預測 vs GT</w:t>
-      </w:r>
-    </w:p>
-    <w:p>
-      <w:pPr>
-        <w:pStyle w:val="Content"/>
-        <w:jc w:val="center"/>
-      </w:pPr>
-      <w:r>
-        <w:drawing>
-          <wp:inline xmlns:a="http://schemas.openxmlformats.org/drawingml/2006/main" xmlns:pic="http://schemas.openxmlformats.org/drawingml/2006/picture">
-            <wp:extent cx="4754880" cy="2717074"/>
-            <wp:docPr id="9" name="Picture 9"/>
-            <wp:cNvGraphicFramePr>
-              <a:graphicFrameLocks noChangeAspect="1"/>
-            </wp:cNvGraphicFramePr>
-            <a:graphic>
-              <a:graphicData uri="http://schemas.openxmlformats.org/drawingml/2006/picture">
-                <pic:pic>
-                  <pic:nvPicPr>
-                    <pic:cNvPr id="0" name="image.png"/>
-                    <pic:cNvPicPr/>
-                  </pic:nvPicPr>
-                  <pic:blipFill>
-                    <a:blip r:embed="rId29"/>
-                    <a:stretch>
-                      <a:fillRect/>
-                    </a:stretch>
-                  </pic:blipFill>
-                  <pic:spPr>
-                    <a:xfrm>
-                      <a:off x="0" y="0"/>
-                      <a:ext cx="4754880" cy="2717074"/>
-                    </a:xfrm>
-                    <a:prstGeom prst="rect"/>
-                  </pic:spPr>
-                </pic:pic>
-              </a:graphicData>
-            </a:graphic>
-          </wp:inline>
-        </w:drawing>
-      </w:r>
-    </w:p>
-    <w:p>
-      <w:pPr>
-        <w:pStyle w:val="Content"/>
-        <w:jc w:val="center"/>
-      </w:pPr>
-      <w:r>
-        <w:t>圖5.4  Sim→Lab 預測與 GT 軌跡對照</w:t>
-      </w:r>
-    </w:p>
-    <w:p>
-      <w:pPr>
-        <w:pStyle w:val="Header2"/>
-      </w:pPr>
-      <w:r>
-        <w:t>5.4 In-sim RSL-RL 閉環示範</w:t>
-      </w:r>
-    </w:p>
-    <w:p>
-      <w:pPr>
-        <w:pStyle w:val="Content"/>
-      </w:pPr>
-      <w:r>
-        <w:t>DirectRLEnv + RSL-RL PPO；修正 GMO writer 生命週期後 gmo_init_captured=True。v3 det MAE=0.115 m 但 pred 近常數（std≈0），低 MAE 部分來自常數預測，非真實追蹤。v5 塑形獎勵 500 iter：pred 具變異（std≈0.48 m），惟 det MAE=0.441 m、r=0.229，未優於 §5.3 SL（MAE=0.41 m，r=0.47）。</w:t>
-      </w:r>
-    </w:p>
-    <w:p>
-      <w:pPr>
-        <w:pStyle w:val="Content"/>
-        <w:jc w:val="center"/>
-      </w:pPr>
-      <w:r>
-        <w:t>表5.1  In-sim RSL-RL hold-out 評估（64 steps）</w:t>
+        <w:t>表5.1  隨機化 v9 階段成功率（contact-only）</w:t>
       </w:r>
     </w:p>
     <w:tbl>
@@ -2359,71 +2122,38 @@
         <w:tblLook w:firstColumn="1" w:firstRow="1" w:lastColumn="0" w:lastRow="0" w:noHBand="0" w:noVBand="1" w:val="04A0"/>
       </w:tblPr>
       <w:tblGrid>
-        <w:gridCol w:w="1442"/>
-        <w:gridCol w:w="1442"/>
-        <w:gridCol w:w="1442"/>
-        <w:gridCol w:w="1442"/>
-        <w:gridCol w:w="1442"/>
-        <w:gridCol w:w="1442"/>
+        <w:gridCol w:w="2884"/>
+        <w:gridCol w:w="2884"/>
+        <w:gridCol w:w="2884"/>
       </w:tblGrid>
       <w:tr>
         <w:tc>
           <w:tcPr>
-            <w:tcW w:type="dxa" w:w="1442"/>
+            <w:tcW w:type="dxa" w:w="2884"/>
           </w:tcPr>
           <w:p>
             <w:r>
-              <w:t>Run</w:t>
+              <w:t>指標</w:t>
             </w:r>
           </w:p>
         </w:tc>
         <w:tc>
           <w:tcPr>
-            <w:tcW w:type="dxa" w:w="1442"/>
+            <w:tcW w:type="dxa" w:w="2884"/>
           </w:tcPr>
           <w:p>
             <w:r>
-              <w:t>Checkpoint</w:t>
+              <w:t>Closed-loop</w:t>
             </w:r>
           </w:p>
         </w:tc>
         <w:tc>
           <w:tcPr>
-            <w:tcW w:type="dxa" w:w="1442"/>
+            <w:tcW w:type="dxa" w:w="2884"/>
           </w:tcPr>
           <w:p>
             <w:r>
-              <w:t>模式</w:t>
-            </w:r>
-          </w:p>
-        </w:tc>
-        <w:tc>
-          <w:tcPr>
-            <w:tcW w:type="dxa" w:w="1442"/>
-          </w:tcPr>
-          <w:p>
-            <w:r>
-              <w:t>MAE(m)</w:t>
-            </w:r>
-          </w:p>
-        </w:tc>
-        <w:tc>
-          <w:tcPr>
-            <w:tcW w:type="dxa" w:w="1442"/>
-          </w:tcPr>
-          <w:p>
-            <w:r>
-              <w:t>r(gt,pred)</w:t>
-            </w:r>
-          </w:p>
-        </w:tc>
-        <w:tc>
-          <w:tcPr>
-            <w:tcW w:type="dxa" w:w="1442"/>
-          </w:tcPr>
-          <w:p>
-            <w:r>
-              <w:t>pred mean±std(m)</w:t>
+              <w:t>Open-loop</w:t>
             </w:r>
           </w:p>
         </w:tc>
@@ -2431,61 +2161,31 @@
       <w:tr>
         <w:tc>
           <w:tcPr>
-            <w:tcW w:type="dxa" w:w="1442"/>
+            <w:tcW w:type="dxa" w:w="2884"/>
           </w:tcPr>
           <w:p>
             <w:r>
-              <w:t>long_v3</w:t>
+              <w:t>Approach ≤ 0.45 m</w:t>
             </w:r>
           </w:p>
         </w:tc>
         <w:tc>
           <w:tcPr>
-            <w:tcW w:type="dxa" w:w="1442"/>
+            <w:tcW w:type="dxa" w:w="2884"/>
           </w:tcPr>
           <w:p>
             <w:r>
-              <w:t>model_199</w:t>
+              <w:t>84.0% (21/25)</w:t>
             </w:r>
           </w:p>
         </w:tc>
         <w:tc>
           <w:tcPr>
-            <w:tcW w:type="dxa" w:w="1442"/>
+            <w:tcW w:type="dxa" w:w="2884"/>
           </w:tcPr>
           <w:p>
             <w:r>
-              <w:t>det</w:t>
-            </w:r>
-          </w:p>
-        </w:tc>
-        <w:tc>
-          <w:tcPr>
-            <w:tcW w:type="dxa" w:w="1442"/>
-          </w:tcPr>
-          <w:p>
-            <w:r>
-              <w:t>0.115</w:t>
-            </w:r>
-          </w:p>
-        </w:tc>
-        <w:tc>
-          <w:tcPr>
-            <w:tcW w:type="dxa" w:w="1442"/>
-          </w:tcPr>
-          <w:p>
-            <w:r>
-              <w:t>0.335</w:t>
-            </w:r>
-          </w:p>
-        </w:tc>
-        <w:tc>
-          <w:tcPr>
-            <w:tcW w:type="dxa" w:w="1442"/>
-          </w:tcPr>
-          <w:p>
-            <w:r>
-              <w:t>1.576±0.000</w:t>
+              <w:t>29.2% (7/24)</w:t>
             </w:r>
           </w:p>
         </w:tc>
@@ -2493,61 +2193,31 @@
       <w:tr>
         <w:tc>
           <w:tcPr>
-            <w:tcW w:type="dxa" w:w="1442"/>
+            <w:tcW w:type="dxa" w:w="2884"/>
           </w:tcPr>
           <w:p>
             <w:r>
-              <w:t>long_v5</w:t>
+              <w:t>Near ≤ 0.35 m</w:t>
             </w:r>
           </w:p>
         </w:tc>
         <w:tc>
           <w:tcPr>
-            <w:tcW w:type="dxa" w:w="1442"/>
+            <w:tcW w:type="dxa" w:w="2884"/>
           </w:tcPr>
           <w:p>
             <w:r>
-              <w:t>model_499</w:t>
+              <w:t>84.0% (21/25)</w:t>
             </w:r>
           </w:p>
         </w:tc>
         <w:tc>
           <w:tcPr>
-            <w:tcW w:type="dxa" w:w="1442"/>
+            <w:tcW w:type="dxa" w:w="2884"/>
           </w:tcPr>
           <w:p>
             <w:r>
-              <w:t>det</w:t>
-            </w:r>
-          </w:p>
-        </w:tc>
-        <w:tc>
-          <w:tcPr>
-            <w:tcW w:type="dxa" w:w="1442"/>
-          </w:tcPr>
-          <w:p>
-            <w:r>
-              <w:t>0.441</w:t>
-            </w:r>
-          </w:p>
-        </w:tc>
-        <w:tc>
-          <w:tcPr>
-            <w:tcW w:type="dxa" w:w="1442"/>
-          </w:tcPr>
-          <w:p>
-            <w:r>
-              <w:t>0.229</w:t>
-            </w:r>
-          </w:p>
-        </w:tc>
-        <w:tc>
-          <w:tcPr>
-            <w:tcW w:type="dxa" w:w="1442"/>
-          </w:tcPr>
-          <w:p>
-            <w:r>
-              <w:t>1.637±0.477</w:t>
+              <w:t>4.2% (1/24)</w:t>
             </w:r>
           </w:p>
         </w:tc>
@@ -2555,61 +2225,31 @@
       <w:tr>
         <w:tc>
           <w:tcPr>
-            <w:tcW w:type="dxa" w:w="1442"/>
+            <w:tcW w:type="dxa" w:w="2884"/>
           </w:tcPr>
           <w:p>
             <w:r>
-              <w:t>long_v5</w:t>
+              <w:t>Final success</w:t>
             </w:r>
           </w:p>
         </w:tc>
         <w:tc>
           <w:tcPr>
-            <w:tcW w:type="dxa" w:w="1442"/>
+            <w:tcW w:type="dxa" w:w="2884"/>
           </w:tcPr>
           <w:p>
             <w:r>
-              <w:t>model_499</w:t>
+              <w:t>20.0% (5/25)</w:t>
             </w:r>
           </w:p>
         </w:tc>
         <w:tc>
           <w:tcPr>
-            <w:tcW w:type="dxa" w:w="1442"/>
+            <w:tcW w:type="dxa" w:w="2884"/>
           </w:tcPr>
           <w:p>
             <w:r>
-              <w:t>stoch</w:t>
-            </w:r>
-          </w:p>
-        </w:tc>
-        <w:tc>
-          <w:tcPr>
-            <w:tcW w:type="dxa" w:w="1442"/>
-          </w:tcPr>
-          <w:p>
-            <w:r>
-              <w:t>0.457</w:t>
-            </w:r>
-          </w:p>
-        </w:tc>
-        <w:tc>
-          <w:tcPr>
-            <w:tcW w:type="dxa" w:w="1442"/>
-          </w:tcPr>
-          <w:p>
-            <w:r>
-              <w:t>0.078</w:t>
-            </w:r>
-          </w:p>
-        </w:tc>
-        <w:tc>
-          <w:tcPr>
-            <w:tcW w:type="dxa" w:w="1442"/>
-          </w:tcPr>
-          <w:p>
-            <w:r>
-              <w:t>1.559±0.481</w:t>
+              <w:t>20.8% (5/24)</w:t>
             </w:r>
           </w:p>
         </w:tc>
@@ -2618,11 +2258,43 @@
     <w:p/>
     <w:p>
       <w:pPr>
+        <w:pStyle w:val="Header2"/>
+      </w:pPr>
+      <w:r>
+        <w:t>5.3 規則監管員 v1</w:t>
+      </w:r>
+    </w:p>
+    <w:p>
+      <w:pPr>
+        <w:pStyle w:val="Content"/>
+      </w:pPr>
+      <w:r>
+        <w:t>當融合距離飽和（約 0.73 m）而 tool0 已達前進上限時，supervisor 以 oracle 距離判斷是否足夠接近，建議進入 standoff／夾取。此設計屬安全包絡，非逐步神經策略；論文 claim 明確區分「控制器不讀 target pose」與「系統層安全仲裁」。</w:t>
+      </w:r>
+    </w:p>
+    <w:p>
+      <w:pPr>
+        <w:pStyle w:val="Header2"/>
+      </w:pPr>
+      <w:r>
+        <w:t>5.4 離線 Physical AI 特徵消融</w:t>
+      </w:r>
+    </w:p>
+    <w:p>
+      <w:pPr>
+        <w:pStyle w:val="Content"/>
+      </w:pPr>
+      <w:r>
+        <w:t>以 physical_ai_v9_skip_lift_clean 步級資料訓練 logistic regression / decision tree 基線。stop_region_label 上，all_features 最佳（F1=0.684）；acoustic_only 達 F1=0.598，優於 pose_only（F1=0.533），顯示聲學特徵含狀態資訊；pose 仍為混淆因子。結果支持離線狀態估計可行性，非可部署控制器。</w:t>
+      </w:r>
+    </w:p>
+    <w:p>
+      <w:pPr>
         <w:pStyle w:val="Content"/>
         <w:jc w:val="center"/>
       </w:pPr>
       <w:r>
-        <w:t>表5.2  與 §5.3 監督基線對照</w:t>
+        <w:t>表5.2  stop_region_label 特徵消融（v9）</w:t>
       </w:r>
     </w:p>
     <w:tbl>
@@ -2631,49 +2303,38 @@
         <w:tblLook w:firstColumn="1" w:firstRow="1" w:lastColumn="0" w:lastRow="0" w:noHBand="0" w:noVBand="1" w:val="04A0"/>
       </w:tblPr>
       <w:tblGrid>
-        <w:gridCol w:w="2163"/>
-        <w:gridCol w:w="2163"/>
-        <w:gridCol w:w="2163"/>
-        <w:gridCol w:w="2163"/>
+        <w:gridCol w:w="2884"/>
+        <w:gridCol w:w="2884"/>
+        <w:gridCol w:w="2884"/>
       </w:tblGrid>
       <w:tr>
         <w:tc>
           <w:tcPr>
-            <w:tcW w:type="dxa" w:w="2163"/>
+            <w:tcW w:type="dxa" w:w="2884"/>
           </w:tcPr>
           <w:p>
             <w:r>
-              <w:t>方法</w:t>
+              <w:t>Feature set</w:t>
             </w:r>
           </w:p>
         </w:tc>
         <w:tc>
           <w:tcPr>
-            <w:tcW w:type="dxa" w:w="2163"/>
+            <w:tcW w:type="dxa" w:w="2884"/>
           </w:tcPr>
           <w:p>
             <w:r>
-              <w:t>MAE (m)</w:t>
+              <w:t>F1</w:t>
             </w:r>
           </w:p>
         </w:tc>
         <w:tc>
           <w:tcPr>
-            <w:tcW w:type="dxa" w:w="2163"/>
+            <w:tcW w:type="dxa" w:w="2884"/>
           </w:tcPr>
           <w:p>
             <w:r>
-              <w:t>Pearson r</w:t>
-            </w:r>
-          </w:p>
-        </w:tc>
-        <w:tc>
-          <w:tcPr>
-            <w:tcW w:type="dxa" w:w="2163"/>
-          </w:tcPr>
-          <w:p>
-            <w:r>
-              <w:t>備註</w:t>
+              <w:t>Balanced accuracy</w:t>
             </w:r>
           </w:p>
         </w:tc>
@@ -2681,41 +2342,31 @@
       <w:tr>
         <w:tc>
           <w:tcPr>
-            <w:tcW w:type="dxa" w:w="2163"/>
+            <w:tcW w:type="dxa" w:w="2884"/>
           </w:tcPr>
           <w:p>
             <w:r>
-              <w:t>Sim→Lab 線性 SL</w:t>
+              <w:t>All features</w:t>
             </w:r>
           </w:p>
         </w:tc>
         <w:tc>
           <w:tcPr>
-            <w:tcW w:type="dxa" w:w="2163"/>
+            <w:tcW w:type="dxa" w:w="2884"/>
           </w:tcPr>
           <w:p>
             <w:r>
-              <w:t>0.41</w:t>
+              <w:t>0.684</w:t>
             </w:r>
           </w:p>
         </w:tc>
         <w:tc>
           <w:tcPr>
-            <w:tcW w:type="dxa" w:w="2163"/>
+            <w:tcW w:type="dxa" w:w="2884"/>
           </w:tcPr>
           <w:p>
             <w:r>
-              <w:t>0.47</w:t>
-            </w:r>
-          </w:p>
-        </w:tc>
-        <w:tc>
-          <w:tcPr>
-            <w:tcW w:type="dxa" w:w="2163"/>
-          </w:tcPr>
-          <w:p>
-            <w:r>
-              <w:t>主學習基線</w:t>
+              <w:t>0.665</w:t>
             </w:r>
           </w:p>
         </w:tc>
@@ -2723,41 +2374,31 @@
       <w:tr>
         <w:tc>
           <w:tcPr>
-            <w:tcW w:type="dxa" w:w="2163"/>
+            <w:tcW w:type="dxa" w:w="2884"/>
           </w:tcPr>
           <w:p>
             <w:r>
-              <w:t>in-sim PPO v3 det</w:t>
+              <w:t>Acoustic only</w:t>
             </w:r>
           </w:p>
         </w:tc>
         <w:tc>
           <w:tcPr>
-            <w:tcW w:type="dxa" w:w="2163"/>
+            <w:tcW w:type="dxa" w:w="2884"/>
           </w:tcPr>
           <w:p>
             <w:r>
-              <w:t>0.115</w:t>
+              <w:t>0.598</w:t>
             </w:r>
           </w:p>
         </w:tc>
         <w:tc>
           <w:tcPr>
-            <w:tcW w:type="dxa" w:w="2163"/>
+            <w:tcW w:type="dxa" w:w="2884"/>
           </w:tcPr>
           <w:p>
             <w:r>
-              <w:t>0.34</w:t>
-            </w:r>
-          </w:p>
-        </w:tc>
-        <w:tc>
-          <w:tcPr>
-            <w:tcW w:type="dxa" w:w="2163"/>
-          </w:tcPr>
-          <w:p>
-            <w:r>
-              <w:t>pred 近常數</w:t>
+              <w:t>0.590</w:t>
             </w:r>
           </w:p>
         </w:tc>
@@ -2765,41 +2406,31 @@
       <w:tr>
         <w:tc>
           <w:tcPr>
-            <w:tcW w:type="dxa" w:w="2163"/>
+            <w:tcW w:type="dxa" w:w="2884"/>
           </w:tcPr>
           <w:p>
             <w:r>
-              <w:t>in-sim PPO v5 det</w:t>
+              <w:t>Pose only</w:t>
             </w:r>
           </w:p>
         </w:tc>
         <w:tc>
           <w:tcPr>
-            <w:tcW w:type="dxa" w:w="2163"/>
+            <w:tcW w:type="dxa" w:w="2884"/>
           </w:tcPr>
           <w:p>
             <w:r>
-              <w:t>0.441</w:t>
+              <w:t>0.533</w:t>
             </w:r>
           </w:p>
         </w:tc>
         <w:tc>
           <w:tcPr>
-            <w:tcW w:type="dxa" w:w="2163"/>
+            <w:tcW w:type="dxa" w:w="2884"/>
           </w:tcPr>
           <w:p>
             <w:r>
-              <w:t>0.229</w:t>
-            </w:r>
-          </w:p>
-        </w:tc>
-        <w:tc>
-          <w:tcPr>
-            <w:tcW w:type="dxa" w:w="2163"/>
-          </w:tcPr>
-          <w:p>
-            <w:r>
-              <w:t>有變異，未優於 SL</w:t>
+              <w:t>0.650</w:t>
             </w:r>
           </w:p>
         </w:tc>
@@ -2808,6 +2439,38 @@
     <w:p/>
     <w:p>
       <w:pPr>
+        <w:pStyle w:val="Header2"/>
+      </w:pPr>
+      <w:r>
+        <w:t>5.5 Tier B 夾取與限制</w:t>
+      </w:r>
+    </w:p>
+    <w:p>
+      <w:pPr>
+        <w:pStyle w:val="Content"/>
+      </w:pPr>
+      <w:r>
+        <w:t>contact-only 模式下，PhysX 非有限態多來自 Robotiq 接觸物理或誤入 lift 路徑，已以 --skip-lift 明確旗標修復 headless 建立 DynamicCuboid 之 bug。SurfaceGripper 官方整合嘗試未成功（runtime 註冊失敗），列為限制與未來工作。</w:t>
+      </w:r>
+    </w:p>
+    <w:p>
+      <w:pPr>
+        <w:pStyle w:val="Header2"/>
+      </w:pPr>
+      <w:r>
+        <w:t>5.6 與 VLM 端到端路線之討論</w:t>
+      </w:r>
+    </w:p>
+    <w:p>
+      <w:pPr>
+        <w:pStyle w:val="Content"/>
+      </w:pPr>
+      <w:r>
+        <w:t>本研究不與 VLM 全任務成功率硬比較，而強調 last-meter 非視覺閉環之互補角色。未來可探索 VLM 粗定位 + 超聲精接近之 hybrid 架構。</w:t>
+      </w:r>
+    </w:p>
+    <w:p>
+      <w:pPr>
         <w:pStyle w:val="Header1"/>
       </w:pPr>
       <w:r>
@@ -2827,7 +2490,7 @@
         <w:pStyle w:val="Content"/>
       </w:pPr>
       <w:r>
-        <w:t>（1）主貢獻：固定 TCP 下 RTX 聲學擷取管線具高可重複性（30/30），early_energy 為優於 peak 之距離 proxy。（2）延伸：同一特徵定義可接入 Lab 動態觀測，Sim→Lab SL 達趨勢級追蹤（r≈0.47）。（3）附錄級：in-sim RL 閉環可跑通，但未在 hold-out 上優於 SL。</w:t>
+        <w:t>（1）RQ1：固定 TCP 下 RTX 聲學管線具高可重複性（30/30），early_energy 為有效距離 proxy。（2）RQ2：閉環超聲接近顯著改善隨機化場景下目標區到達率（84% vs 29%）。（3）RQ3：離線 Physical AI 顯示 acoustic_only 含可測量狀態信號（F1≈0.598）。（4）RQ4：最終夾取約 20%，應列為下游 PhysX／夾爪限制，非否定聲學主線。</w:t>
       </w:r>
     </w:p>
     <w:p>
@@ -2843,7 +2506,7 @@
         <w:pStyle w:val="Content"/>
       </w:pPr>
       <w:r>
-        <w:t>電聲觀點：室內多徑使距離資訊主要體現在早期能量之弱趨勢，而非 peak 飽和區。模擬觀點：RTX 與 PRA early energy 於 n=6 呈中度趨勢對應（p≈0.16，未達顯著），模型機制仍不同，支持以任務級指標（ρ、CV、PASS）論證可行性。學習觀點：SL 在弱信號下較穩健；RL 低 MAE 需搭配 pred 變異解讀，避免過度宣稱。</w:t>
+        <w:t>電聲觀點：室內多徑使距離資訊體現在早期能量之弱趨勢；飽和 peak 不適合作距離特徵。控制觀點：閉環融合 + 走廊幾何可將趨勢級特徵轉為可重現接近行為。Physical AI 觀點：隨機化協定必要，以避免 pose 捷徑；多特徵優於單一閾值。操作觀點：接觸／抬升整合仍是 Sim2Real 前主要瓶頸。</w:t>
       </w:r>
     </w:p>
     <w:p>
@@ -2912,7 +2575,7 @@
           </w:tcPr>
           <w:p>
             <w:r>
-              <w:t>Sim 主實驗</w:t>
+              <w:t>Phase A</w:t>
             </w:r>
           </w:p>
         </w:tc>
@@ -2922,7 +2585,7 @@
           </w:tcPr>
           <w:p>
             <w:r>
-              <w:t>30/30 可重複；early_energy 趨勢；RTX×PRA early energy 中度趨勢（ρ≈+0.66, p≈0.16, n=6, pilot）</w:t>
+              <w:t>30/30；early_energy 距離趨勢（ρ≈−0.66, n=6）</w:t>
             </w:r>
           </w:p>
         </w:tc>
@@ -2932,7 +2595,7 @@
           </w:tcPr>
           <w:p>
             <w:r>
-              <w:t>波形等價；跨模型統計顯著一致；厘米級測距</w:t>
+              <w:t>厘米級測距；波形等價</w:t>
             </w:r>
           </w:p>
         </w:tc>
@@ -2944,7 +2607,7 @@
           </w:tcPr>
           <w:p>
             <w:r>
-              <w:t>Lab / SL</w:t>
+              <w:t>Phase B</w:t>
             </w:r>
           </w:p>
         </w:tc>
@@ -2954,7 +2617,7 @@
           </w:tcPr>
           <w:p>
             <w:r>
-              <w:t>動態觀測可行；Sim→Lab 趨勢遷移 r≈0.47</w:t>
+              <w:t>閉環 approach ≤0.45 m：84% vs open-loop 29%</w:t>
             </w:r>
           </w:p>
         </w:tc>
@@ -2964,7 +2627,7 @@
           </w:tcPr>
           <w:p>
             <w:r>
-              <w:t>MAE 0.41 m 可部署；高 R² 即物理測距</w:t>
+              <w:t>純超聲端到端夾取；零 oracle 系統</w:t>
             </w:r>
           </w:p>
         </w:tc>
@@ -2976,7 +2639,7 @@
           </w:tcPr>
           <w:p>
             <w:r>
-              <w:t>in-sim RL</w:t>
+              <w:t>Physical AI</w:t>
             </w:r>
           </w:p>
         </w:tc>
@@ -2986,7 +2649,7 @@
           </w:tcPr>
           <w:p>
             <w:r>
-              <w:t>DirectRLEnv 閉環可跑通；GMO 修正後有效</w:t>
+              <w:t>acoustic_only stop_region F1≈0.598</w:t>
             </w:r>
           </w:p>
         </w:tc>
@@ -2996,7 +2659,39 @@
           </w:tcPr>
           <w:p>
             <w:r>
-              <w:t>優於 SL；v3 低 MAE 即學會測距</w:t>
+              <w:t>可部署學習控制器</w:t>
+            </w:r>
+          </w:p>
+        </w:tc>
+      </w:tr>
+      <w:tr>
+        <w:tc>
+          <w:tcPr>
+            <w:tcW w:type="dxa" w:w="2884"/>
+          </w:tcPr>
+          <w:p>
+            <w:r>
+              <w:t>Phase C</w:t>
+            </w:r>
+          </w:p>
+        </w:tc>
+        <w:tc>
+          <w:tcPr>
+            <w:tcW w:type="dxa" w:w="2884"/>
+          </w:tcPr>
+          <w:p>
+            <w:r>
+              <w:t>Tier B contact-only 階段化評估</w:t>
+            </w:r>
+          </w:p>
+        </w:tc>
+        <w:tc>
+          <w:tcPr>
+            <w:tcW w:type="dxa" w:w="2884"/>
+          </w:tcPr>
+          <w:p>
+            <w:r>
+              <w:t>穩定最終夾取；部署級 grasp rate</w:t>
             </w:r>
           </w:p>
         </w:tc>
@@ -3018,7 +2713,7 @@
           </w:tcPr>
           <w:p>
             <w:r>
-              <w:t>可審計可行性管線</w:t>
+              <w:t>可審計 Sim 可行性管線</w:t>
             </w:r>
           </w:p>
         </w:tc>
@@ -3028,7 +2723,7 @@
           </w:tcPr>
           <w:p>
             <w:r>
-              <w:t>CH201 實機已驗證；數位雙生完成</w:t>
+              <w:t>CH201 實機已驗證；優於 VLM 全任務</w:t>
             </w:r>
           </w:p>
         </w:tc>
@@ -3048,7 +2743,23 @@
         <w:pStyle w:val="Content"/>
       </w:pPr>
       <w:r>
-        <w:t>建議：（1）CH201 實機 task-level 協定；（2）擴大距離／離軸點位以增加 early_energy 動態；（3）特徵工程與不確定性量化；（4）以 replication package 支援口試重現。</w:t>
+        <w:t>建議：（1）CH201 實機 task-level 協定；（2）SurfaceGripper isolated smoke 後再整合 UR10；（3）擴充隨機化資料並分離 approach/contact/lift 指標；（4）VLM + 超聲 hybrid；（5）以 replication package 支援口試重現。</w:t>
+      </w:r>
+    </w:p>
+    <w:p>
+      <w:pPr>
+        <w:pStyle w:val="Header2"/>
+      </w:pPr>
+      <w:r>
+        <w:t>附錄說明（Isaac Lab 延伸）</w:t>
+      </w:r>
+    </w:p>
+    <w:p>
+      <w:pPr>
+        <w:pStyle w:val="Content"/>
+      </w:pPr>
+      <w:r>
+        <w:t>Isaac Lab 動態 smoke（ρ≈−0.48）、Sim→Lab SL（r≈0.47）、in-sim RL 閉環示範已實作，保留為附錄或未來工作，不計入本版主貢獻。</w:t>
       </w:r>
     </w:p>
     <w:p>

</xml_diff>